<commit_message>
feat(deep-learning): autoencoder expression programs + WT-vs-AVP-OX stress response (R8, Fig 8-9)
- deep_clustering/: PyTorch autoencoder clusters genes into 12 co-expression PROGRAMS (bulk data ->
  programs, NOT single cells - framed honestly everywhere), GO + curated AT cell-type marker overlap,
  per-program PhysioSpace-style stress scoring per genotype
- Result: AVP-OX attenuates stress/defence programs (P2 defence, P11 biotic, P4 cell-wall) while
  sustaining growth/metabolic programs (P5 cell cycle, P9 nucleotide) - localises the whole-transcriptome
  thesis to specific functional programs
- Fig 8 (program atlas) + Fig 9 (WT vs AVP-OX stress), rendered & verified
- Manuscript: new R8 + Methods paragraph + Fig 8/9 legends; Word draft rebuilt (9 figures); site + figure
  plan updated; gitignore the GPL reference-space export (regenerable)

Co-Authored-By: Claude Fable 5 <noreply@anthropic.com>
</commit_message>
<xml_diff>
--- a/manuscript/TICTOC_manuscript_draft.docx
+++ b/manuscript/TICTOC_manuscript_draft.docx
@@ -1169,6 +1169,174 @@
       </w:r>
       <w:r>
         <w:t xml:space="preserve">).</w:t>
+      </w:r>
+    </w:p>
+    <w:p>
+      <w:pPr>
+        <w:pStyle w:val="Heading2"/>
+      </w:pPr>
+      <w:r>
+        <w:t xml:space="preserve">R8. Expression-program analysis pinpoints the functional programs behind the AVP-OX effect  → </w:t>
+      </w:r>
+      <w:r>
+        <w:rPr>
+          <w:b/>
+          <w:bCs/>
+        </w:rPr>
+        <w:t xml:space="preserve">Fig 8, Fig 9</w:t>
+      </w:r>
+    </w:p>
+    <w:p>
+      <w:pPr>
+        <w:spacing w:after="120" w:line="276"/>
+      </w:pPr>
+      <w:r>
+        <w:rPr>
+          <w:i/>
+          <w:iCs/>
+        </w:rPr>
+        <w:t xml:space="preserve">(Bulk RNA-seq: an autoencoder clusters genes into co-expression PROGRAMS — a neural analogue of WGCNA — not single cells; cell-type labels are marker-based associations.)</w:t>
+      </w:r>
+      <w:r>
+        <w:t xml:space="preserve"> To resolve </w:t>
+      </w:r>
+      <w:r>
+        <w:rPr>
+          <w:i/>
+          <w:iCs/>
+        </w:rPr>
+        <w:t xml:space="preserve">which</w:t>
+      </w:r>
+      <w:r>
+        <w:t xml:space="preserve"> functional programs drive the genotype difference, we trained an autoencoder on the expression matrix and clustered genes into 12 co-expression programs. The programs were strongly </w:t>
+      </w:r>
+      <w:r>
+        <w:rPr>
+          <w:b/>
+          <w:bCs/>
+        </w:rPr>
+        <w:t xml:space="preserve">tissue-partitioned</w:t>
+      </w:r>
+      <w:r>
+        <w:t xml:space="preserve"> (Fig 8): root programs included lignin-biosynthesis/root-development (P1), cell-cycle (P5), ion-homeostasis (P6), a chemical-defence program (P2) and secondary-cell-wall biogenesis (P4); shoot programs included photosynthesis (P10) and an osmotic-stress program (P0). Several carried canonical Arabidopsis </w:t>
+      </w:r>
+      <w:r>
+        <w:rPr>
+          <w:b/>
+          <w:bCs/>
+        </w:rPr>
+        <w:t xml:space="preserve">cell-type marker signatures</w:t>
+      </w:r>
+      <w:r>
+        <w:t xml:space="preserve"> — P1 endodermis/vascular (</w:t>
+      </w:r>
+      <w:r>
+        <w:rPr>
+          <w:i/>
+          <w:iCs/>
+        </w:rPr>
+        <w:t xml:space="preserve">SCR</w:t>
+      </w:r>
+      <w:r>
+        <w:t xml:space="preserve">, </w:t>
+      </w:r>
+      <w:r>
+        <w:rPr>
+          <w:i/>
+          <w:iCs/>
+        </w:rPr>
+        <w:t xml:space="preserve">MYB36</w:t>
+      </w:r>
+      <w:r>
+        <w:t xml:space="preserve">, </w:t>
+      </w:r>
+      <w:r>
+        <w:rPr>
+          <w:i/>
+          <w:iCs/>
+        </w:rPr>
+        <w:t xml:space="preserve">CASP1</w:t>
+      </w:r>
+      <w:r>
+        <w:t xml:space="preserve">, </w:t>
+      </w:r>
+      <w:r>
+        <w:rPr>
+          <w:i/>
+          <w:iCs/>
+        </w:rPr>
+        <w:t xml:space="preserve">SHR</w:t>
+      </w:r>
+      <w:r>
+        <w:t xml:space="preserve">), P10 mesophyll (</w:t>
+      </w:r>
+      <w:r>
+        <w:rPr>
+          <w:i/>
+          <w:iCs/>
+        </w:rPr>
+        <w:t xml:space="preserve">CAB1</w:t>
+      </w:r>
+      <w:r>
+        <w:t xml:space="preserve">, </w:t>
+      </w:r>
+      <w:r>
+        <w:rPr>
+          <w:i/>
+          <w:iCs/>
+        </w:rPr>
+        <w:t xml:space="preserve">RBCS</w:t>
+      </w:r>
+      <w:r>
+        <w:t xml:space="preserve">), P0 guard cell (</w:t>
+      </w:r>
+      <w:r>
+        <w:rPr>
+          <w:i/>
+          <w:iCs/>
+        </w:rPr>
+        <w:t xml:space="preserve">MYB60</w:t>
+      </w:r>
+      <w:r>
+        <w:t xml:space="preserve">) — providing an interpretable, marker-based cell-type association (not a single-cell identity).</w:t>
+      </w:r>
+    </w:p>
+    <w:p>
+      <w:pPr>
+        <w:spacing w:after="120" w:line="276"/>
+      </w:pPr>
+      <w:r>
+        <w:t xml:space="preserve">Scoring each program's Flight−Ground response against the Arabidopsis PhysioSpace stress axes and contrasting genotypes (Fig 9) recapitulated the whole-transcriptome result </w:t>
+      </w:r>
+      <w:r>
+        <w:rPr>
+          <w:b/>
+          <w:bCs/>
+        </w:rPr>
+        <w:t xml:space="preserve">at program resolution and localised it</w:t>
+      </w:r>
+      <w:r>
+        <w:t xml:space="preserve">: the AVP-OX lines specifically </w:t>
+      </w:r>
+      <w:r>
+        <w:rPr>
+          <w:b/>
+          <w:bCs/>
+        </w:rPr>
+        <w:t xml:space="preserve">attenuated the stress/defence programs</w:t>
+      </w:r>
+      <w:r>
+        <w:t xml:space="preserve"> (chemical-defence P2, biotic P11, secondary-cell-wall P4, and the shoot osmotic/hormone programs; AVP-OX − WT Δ negative) while </w:t>
+      </w:r>
+      <w:r>
+        <w:rPr>
+          <w:b/>
+          <w:bCs/>
+        </w:rPr>
+        <w:t xml:space="preserve">sustaining or increasing growth/metabolic programs</w:t>
+      </w:r>
+      <w:r>
+        <w:t xml:space="preserve"> (cell-cycle P5, nucleotide-metabolism P9; Δ positive). Thus the "less stress, more growth" phenotype is not a diffuse shift but is carried by a defined set of functional programs — a defence/stress module that AVP-OX dampens and a growth/cell-cycle module it preserves.</w:t>
       </w:r>
     </w:p>
     <w:p>
@@ -1672,6 +1840,51 @@
           <w:b/>
           <w:bCs/>
         </w:rPr>
+        <w:t xml:space="preserve">Expression-program (autoencoder) analysis.</w:t>
+      </w:r>
+      <w:r>
+        <w:t xml:space="preserve"> </w:t>
+      </w:r>
+      <w:r>
+        <w:rPr>
+          <w:i/>
+          <w:iCs/>
+        </w:rPr>
+        <w:t xml:space="preserve">(`deep_clustering/`.)</w:t>
+      </w:r>
+      <w:r>
+        <w:t xml:space="preserve"> The top 8,000 most-variable genes (log₂-CPM, per-gene z-scored across the 48 libraries) were embedded with an autoencoder (48→32→12→32→48; PyTorch, Adam, 400 epochs, MSE loss; seed fixed) and the 12-dimensional latent codes clustered into 12 gene programs by </w:t>
+      </w:r>
+      <w:r>
+        <w:rPr>
+          <w:i/>
+          <w:iCs/>
+        </w:rPr>
+        <w:t xml:space="preserve">k</w:t>
+      </w:r>
+      <w:r>
+        <w:t xml:space="preserve">-means; UMAP was used for visualisation. </w:t>
+      </w:r>
+      <w:r>
+        <w:rPr>
+          <w:b/>
+          <w:bCs/>
+        </w:rPr>
+        <w:t xml:space="preserve">This is bulk RNA-seq — programs are gene co-expression clusters, not single cells.</w:t>
+      </w:r>
+      <w:r>
+        <w:t xml:space="preserve"> Each program was annotated by GO (BP; clusterProfiler, ortholog-mapped) and by a curated panel of canonical Arabidopsis root/leaf cell-type marker genes (a marker-overlap association, not single-cell identity). Each program's spaceflight response was scored against the Arabidopsis PhysioSpace stress axes as the Pearson correlation between the program genes' Flight−Ground log₂ fold change (in the program's dominant tissue, Gohir→AT→Entrez) and each axis's gene weights over shared genes (≥ 15), then contrasted between wild type and the AVP-OX lines.</w:t>
+      </w:r>
+    </w:p>
+    <w:p>
+      <w:pPr>
+        <w:spacing w:after="120" w:line="276"/>
+      </w:pPr>
+      <w:r>
+        <w:rPr>
+          <w:b/>
+          <w:bCs/>
+        </w:rPr>
         <w:t xml:space="preserve">PhysioSpace.</w:t>
       </w:r>
       <w:r>
@@ -1916,6 +2129,36 @@
       </w:r>
       <w:r>
         <w:t xml:space="preserve"> Spaceflight elicits a tissue-specific hypoxia/wounding response with translational suppression; AVP-OX attenuates the defence/stress arm while sustaining stronger root growth.</w:t>
+      </w:r>
+    </w:p>
+    <w:p>
+      <w:pPr>
+        <w:spacing w:after="120" w:line="276"/>
+      </w:pPr>
+      <w:r>
+        <w:rPr>
+          <w:b/>
+          <w:bCs/>
+        </w:rPr>
+        <w:t xml:space="preserve">Figure 8. Autoencoder expression-program atlas.</w:t>
+      </w:r>
+      <w:r>
+        <w:t xml:space="preserve"> (a) Program mean expression (z-score) across genotype × tissue × treatment, with each program's top GO function and, where applicable, its marker-associated cell type; programs partition strongly by tissue. (b) UMAP of the autoencoder gene embedding, coloured by program. Bulk RNA-seq — programs are gene co-expression clusters, not single cells.</w:t>
+      </w:r>
+    </w:p>
+    <w:p>
+      <w:pPr>
+        <w:spacing w:after="120" w:line="276"/>
+      </w:pPr>
+      <w:r>
+        <w:rPr>
+          <w:b/>
+          <w:bCs/>
+        </w:rPr>
+        <w:t xml:space="preserve">Figure 9. Program-level stress response, WT vs AVP-OX.</w:t>
+      </w:r>
+      <w:r>
+        <w:t xml:space="preserve"> (a) PhysioSpace-style score of each program's Flight−Ground response against Arabidopsis stress axes in wild type. (b) AVP-OX − WT difference: the engineered lines attenuate the stress/defence programs (orange) while sustaining growth/metabolic programs (purple), localising the whole-transcriptome effect to specific functional programs.</w:t>
       </w:r>
     </w:p>
     <w:p>
@@ -3682,7 +3925,7 @@
       <w:r>
         <w:drawing>
           <wp:inline distT="0" distB="0" distL="0" distR="0">
-            <wp:extent cx="5715000" cy="3619500"/>
+            <wp:extent cx="5715000" cy="3324225"/>
             <wp:effectExtent t="0" r="0" b="0" l="0"/>
             <wp:docPr id="1" name="Figure 2" descr="Root architecture over days 3–6 (Flight vs Ground by genotype)." title="Figure 2"/>
             <wp:cNvGraphicFramePr>
@@ -3707,7 +3950,7 @@
                   <pic:spPr bwMode="auto">
                     <a:xfrm>
                       <a:off x="0" y="0"/>
-                      <a:ext cx="5715000" cy="3619500"/>
+                      <a:ext cx="5715000" cy="3324225"/>
                     </a:xfrm>
                     <a:prstGeom prst="rect">
                       <a:avLst/>
@@ -3743,7 +3986,7 @@
       <w:r>
         <w:drawing>
           <wp:inline distT="0" distB="0" distL="0" distR="0">
-            <wp:extent cx="5715000" cy="2971800"/>
+            <wp:extent cx="5715000" cy="3276600"/>
             <wp:effectExtent t="0" r="0" b="0" l="0"/>
             <wp:docPr id="1" name="Figure 3" descr="Spaceflight DEG counts per genotype × tissue (up/down)." title="Figure 3"/>
             <wp:cNvGraphicFramePr>
@@ -3768,7 +4011,7 @@
                   <pic:spPr bwMode="auto">
                     <a:xfrm>
                       <a:off x="0" y="0"/>
-                      <a:ext cx="5715000" cy="2971800"/>
+                      <a:ext cx="5715000" cy="3276600"/>
                     </a:xfrm>
                     <a:prstGeom prst="rect">
                       <a:avLst/>
@@ -3865,7 +4108,7 @@
       <w:r>
         <w:drawing>
           <wp:inline distT="0" distB="0" distL="0" distR="0">
-            <wp:extent cx="5715000" cy="6000750"/>
+            <wp:extent cx="5715000" cy="6124575"/>
             <wp:effectExtent t="0" r="0" b="0" l="0"/>
             <wp:docPr id="1" name="Figure 5" descr="GO biological-process enrichment across key contrasts." title="Figure 5"/>
             <wp:cNvGraphicFramePr>
@@ -3890,7 +4133,7 @@
                   <pic:spPr bwMode="auto">
                     <a:xfrm>
                       <a:off x="0" y="0"/>
-                      <a:ext cx="5715000" cy="6000750"/>
+                      <a:ext cx="5715000" cy="6124575"/>
                     </a:xfrm>
                     <a:prstGeom prst="rect">
                       <a:avLst/>
@@ -3926,7 +4169,7 @@
       <w:r>
         <w:drawing>
           <wp:inline distT="0" distB="0" distL="0" distR="0">
-            <wp:extent cx="5715000" cy="6238875"/>
+            <wp:extent cx="5715000" cy="6257925"/>
             <wp:effectExtent t="0" r="0" b="0" l="0"/>
             <wp:docPr id="1" name="Figure 6" descr="PhysioSpace stress-pattern decoding (stress axis × genotype × tissue)." title="Figure 6"/>
             <wp:cNvGraphicFramePr>
@@ -3951,7 +4194,7 @@
                   <pic:spPr bwMode="auto">
                     <a:xfrm>
                       <a:off x="0" y="0"/>
-                      <a:ext cx="5715000" cy="6238875"/>
+                      <a:ext cx="5715000" cy="6257925"/>
                     </a:xfrm>
                     <a:prstGeom prst="rect">
                       <a:avLst/>
@@ -4038,6 +4281,128 @@
       </w:r>
       <w:r>
         <w:t xml:space="preserve">Integrative model — AVP-OX as a stress attenuator.</w:t>
+      </w:r>
+    </w:p>
+    <w:p>
+      <w:pPr>
+        <w:spacing w:before="160"/>
+        <w:jc w:val="center"/>
+      </w:pPr>
+      <w:r>
+        <w:drawing>
+          <wp:inline distT="0" distB="0" distL="0" distR="0">
+            <wp:extent cx="5715000" cy="2924175"/>
+            <wp:effectExtent t="0" r="0" b="0" l="0"/>
+            <wp:docPr id="1" name="Figure 8" descr="Autoencoder expression-program atlas (bulk RNA-seq; programs, not cells)." title="Figure 8"/>
+            <wp:cNvGraphicFramePr>
+              <a:graphicFrameLocks xmlns:a="http://schemas.openxmlformats.org/drawingml/2006/main" noChangeAspect="1"/>
+            </wp:cNvGraphicFramePr>
+            <a:graphic xmlns:a="http://schemas.openxmlformats.org/drawingml/2006/main">
+              <a:graphicData uri="http://schemas.openxmlformats.org/drawingml/2006/picture">
+                <pic:pic xmlns:pic="http://schemas.openxmlformats.org/drawingml/2006/picture">
+                  <pic:nvPicPr>
+                    <pic:cNvPr id="0" name="" descr=""/>
+                    <pic:cNvPicPr>
+                      <a:picLocks noChangeAspect="1" noChangeArrowheads="1"/>
+                    </pic:cNvPicPr>
+                  </pic:nvPicPr>
+                  <pic:blipFill>
+                    <a:blip r:embed="rId14" cstate="none"/>
+                    <a:srcRect/>
+                    <a:stretch>
+                      <a:fillRect/>
+                    </a:stretch>
+                  </pic:blipFill>
+                  <pic:spPr bwMode="auto">
+                    <a:xfrm>
+                      <a:off x="0" y="0"/>
+                      <a:ext cx="5715000" cy="2924175"/>
+                    </a:xfrm>
+                    <a:prstGeom prst="rect">
+                      <a:avLst/>
+                    </a:prstGeom>
+                  </pic:spPr>
+                </pic:pic>
+              </a:graphicData>
+            </a:graphic>
+          </wp:inline>
+        </w:drawing>
+      </w:r>
+    </w:p>
+    <w:p>
+      <w:pPr>
+        <w:spacing w:after="160"/>
+      </w:pPr>
+      <w:r>
+        <w:rPr>
+          <w:b/>
+          <w:bCs/>
+        </w:rPr>
+        <w:t xml:space="preserve">Figure 8. </w:t>
+      </w:r>
+      <w:r>
+        <w:t xml:space="preserve">Autoencoder expression-program atlas (bulk RNA-seq; programs, not cells).</w:t>
+      </w:r>
+    </w:p>
+    <w:p>
+      <w:pPr>
+        <w:spacing w:before="160"/>
+        <w:jc w:val="center"/>
+      </w:pPr>
+      <w:r>
+        <w:drawing>
+          <wp:inline distT="0" distB="0" distL="0" distR="0">
+            <wp:extent cx="5715000" cy="2362200"/>
+            <wp:effectExtent t="0" r="0" b="0" l="0"/>
+            <wp:docPr id="1" name="Figure 9" descr="Program stress response, WT vs AVP-OX." title="Figure 9"/>
+            <wp:cNvGraphicFramePr>
+              <a:graphicFrameLocks xmlns:a="http://schemas.openxmlformats.org/drawingml/2006/main" noChangeAspect="1"/>
+            </wp:cNvGraphicFramePr>
+            <a:graphic xmlns:a="http://schemas.openxmlformats.org/drawingml/2006/main">
+              <a:graphicData uri="http://schemas.openxmlformats.org/drawingml/2006/picture">
+                <pic:pic xmlns:pic="http://schemas.openxmlformats.org/drawingml/2006/picture">
+                  <pic:nvPicPr>
+                    <pic:cNvPr id="0" name="" descr=""/>
+                    <pic:cNvPicPr>
+                      <a:picLocks noChangeAspect="1" noChangeArrowheads="1"/>
+                    </pic:cNvPicPr>
+                  </pic:nvPicPr>
+                  <pic:blipFill>
+                    <a:blip r:embed="rId15" cstate="none"/>
+                    <a:srcRect/>
+                    <a:stretch>
+                      <a:fillRect/>
+                    </a:stretch>
+                  </pic:blipFill>
+                  <pic:spPr bwMode="auto">
+                    <a:xfrm>
+                      <a:off x="0" y="0"/>
+                      <a:ext cx="5715000" cy="2362200"/>
+                    </a:xfrm>
+                    <a:prstGeom prst="rect">
+                      <a:avLst/>
+                    </a:prstGeom>
+                  </pic:spPr>
+                </pic:pic>
+              </a:graphicData>
+            </a:graphic>
+          </wp:inline>
+        </w:drawing>
+      </w:r>
+    </w:p>
+    <w:p>
+      <w:pPr>
+        <w:spacing w:after="160"/>
+      </w:pPr>
+      <w:r>
+        <w:rPr>
+          <w:b/>
+          <w:bCs/>
+        </w:rPr>
+        <w:t xml:space="preserve">Figure 9. </w:t>
+      </w:r>
+      <w:r>
+        <w:t xml:space="preserve">Program stress response, WT vs AVP-OX.</w:t>
       </w:r>
     </w:p>
     <w:sectPr>

</xml_diff>

<commit_message>
docs(manuscript): add Future directions note (pairing/causal model; single-cell/spatial; calibration)
- Discussion: two extensions — (1) library->plant pairing enables causal mediation/DIABLO at n~24 to
  test the isoprenoid->hormone route; (2) single-nucleus/spatial transcriptomics replaces bulk programs
  (R8) with real cell types via the same deep_clustering pipeline. Plus calibrated imaging + replication.
- Rebuild Word draft

Co-Authored-By: Claude Fable 5 <noreply@anthropic.com>
</commit_message>
<xml_diff>
--- a/manuscript/TICTOC_manuscript_draft.docx
+++ b/manuscript/TICTOC_manuscript_draft.docx
@@ -1460,6 +1460,82 @@
       </w:pPr>
       <w:r>
         <w:t xml:space="preserve">Implications for engineering crops for spaceflight agriculture.</w:t>
+      </w:r>
+    </w:p>
+    <w:p>
+      <w:pPr>
+        <w:spacing w:after="120" w:line="276"/>
+      </w:pPr>
+      <w:r>
+        <w:rPr>
+          <w:b/>
+          <w:bCs/>
+        </w:rPr>
+        <w:t xml:space="preserve">Future directions.</w:t>
+      </w:r>
+      <w:r>
+        <w:t xml:space="preserve"> Two extensions would convert the present correlational, bulk-level findings into mechanistic ones. First, </w:t>
+      </w:r>
+      <w:r>
+        <w:rPr>
+          <w:b/>
+          <w:bCs/>
+        </w:rPr>
+        <w:t xml:space="preserve">individually pairing RNA-seq to imaged plants</w:t>
+      </w:r>
+      <w:r>
+        <w:t xml:space="preserve"> (a library→plant manifest; Methods) would break the group-level Flight/growth collinearity and permit a causal test — a mediation model (Treatment → expression → root trait) or multi-block integration (sPLS/DIABLO) at n ≈ 24 — of whether the signalling/isoprenoid programme actually drives the root-growth phenotype, with hormone-precursor metabolism (gibberellins, brassinosteroids, strigolactones) the leading candidate to target with metabolite assays. Second, </w:t>
+      </w:r>
+      <w:r>
+        <w:rPr>
+          <w:b/>
+          <w:bCs/>
+        </w:rPr>
+        <w:t xml:space="preserve">single-nucleus or spatial transcriptomics</w:t>
+      </w:r>
+      <w:r>
+        <w:t xml:space="preserve"> of spaceflight roots would replace the bulk expression </w:t>
+      </w:r>
+      <w:r>
+        <w:rPr>
+          <w:i/>
+          <w:iCs/>
+        </w:rPr>
+        <w:t xml:space="preserve">programs</w:t>
+      </w:r>
+      <w:r>
+        <w:t xml:space="preserve"> (R8) with genuine cell types: the autoencoder → program → GO/PhysioSpace pipeline developed here (</w:t>
+      </w:r>
+      <w:r>
+        <w:rPr>
+          <w:rFonts w:ascii="Consolas" w:cs="Consolas" w:eastAsia="Consolas" w:hAnsi="Consolas"/>
+          <w:sz w:val="20"/>
+          <w:szCs w:val="20"/>
+        </w:rPr>
+        <w:t xml:space="preserve">deep_clustering/</w:t>
+      </w:r>
+      <w:r>
+        <w:t xml:space="preserve">) applies directly to single-cell data, so the same framework would reveal </w:t>
+      </w:r>
+      <w:r>
+        <w:rPr>
+          <w:i/>
+          <w:iCs/>
+        </w:rPr>
+        <w:t xml:space="preserve">which cell types</w:t>
+      </w:r>
+      <w:r>
+        <w:t xml:space="preserve"> mount, or dampen, the spaceflight stress response — and whether the AVP-OX attenuation is uniform across the radial root axis or concentrated in specific layers (e.g. the endodermis/vascular and cortex programs flagged here). Confirming the root-growth magnitude also requires </w:t>
+      </w:r>
+      <w:r>
+        <w:rPr>
+          <w:b/>
+          <w:bCs/>
+        </w:rPr>
+        <w:t xml:space="preserve">calibrated imaging</w:t>
+      </w:r>
+      <w:r>
+        <w:t xml:space="preserve"> (a scale reference per Flight/Ground image set) and independent flights to establish reproducibility.</w:t>
       </w:r>
     </w:p>
     <w:p>

</xml_diff>